<commit_message>
审查规则 RULE LLM BOTH
</commit_message>
<xml_diff>
--- a/document_report.docx
+++ b/document_report.docx
@@ -90,7 +90,7 @@
           </w:tcPr>
           <w:p>
             <w:r>
-              <w:t>0:01:57.710180</w:t>
+              <w:t>0:02:08.646377</w:t>
             </w:r>
           </w:p>
         </w:tc>
@@ -153,7 +153,7 @@
           </w:tcPr>
           <w:p>
             <w:r>
-              <w:t>14</w:t>
+              <w:t>15</w:t>
             </w:r>
           </w:p>
         </w:tc>
@@ -175,7 +175,7 @@
           </w:tcPr>
           <w:p>
             <w:r>
-              <w:t>11</w:t>
+              <w:t>13</w:t>
             </w:r>
           </w:p>
         </w:tc>
@@ -197,29 +197,7 @@
           </w:tcPr>
           <w:p>
             <w:r>
-              <w:t>3</w:t>
-            </w:r>
-          </w:p>
-        </w:tc>
-      </w:tr>
-      <w:tr>
-        <w:tc>
-          <w:tcPr>
-            <w:tcW w:type="dxa" w:w="4320"/>
-          </w:tcPr>
-          <w:p>
-            <w:r>
-              <w:t>LLM问题数</w:t>
-            </w:r>
-          </w:p>
-        </w:tc>
-        <w:tc>
-          <w:tcPr>
-            <w:tcW w:type="dxa" w:w="4320"/>
-          </w:tcPr>
-          <w:p>
-            <w:r>
-              <w:t>13</w:t>
+              <w:t>2</w:t>
             </w:r>
           </w:p>
         </w:tc>
@@ -230,7 +208,41 @@
         <w:pStyle w:val="Heading1"/>
       </w:pPr>
       <w:r>
-        <w:t>规则审查问题</w:t>
+        <w:t>详细结果</w:t>
+      </w:r>
+    </w:p>
+    <w:p>
+      <w:pPr>
+        <w:pStyle w:val="Heading2"/>
+      </w:pPr>
+      <w:r>
+        <w:t>章节 section_1</w:t>
+      </w:r>
+    </w:p>
+    <w:p>
+      <w:r>
+        <w:t>逆风而行的你...</w:t>
+      </w:r>
+    </w:p>
+    <w:p>
+      <w:pPr>
+        <w:pStyle w:val="Heading2"/>
+      </w:pPr>
+      <w:r>
+        <w:t>章节 section_2</w:t>
+      </w:r>
+    </w:p>
+    <w:p>
+      <w:r>
+        <w:t>1.标题...</w:t>
+      </w:r>
+    </w:p>
+    <w:p>
+      <w:pPr>
+        <w:pStyle w:val="Heading3"/>
+      </w:pPr>
+      <w:r>
+        <w:t>规则问题</w:t>
       </w:r>
     </w:p>
     <w:tbl>
@@ -240,45 +252,56 @@
         <w:tblLook w:firstColumn="1" w:firstRow="1" w:lastColumn="0" w:lastRow="0" w:noHBand="0" w:noVBand="1" w:val="04A0"/>
       </w:tblPr>
       <w:tblGrid>
-        <w:gridCol w:w="2160"/>
-        <w:gridCol w:w="2160"/>
-        <w:gridCol w:w="2160"/>
-        <w:gridCol w:w="2160"/>
+        <w:gridCol w:w="1728"/>
+        <w:gridCol w:w="1728"/>
+        <w:gridCol w:w="1728"/>
+        <w:gridCol w:w="1728"/>
+        <w:gridCol w:w="1728"/>
       </w:tblGrid>
       <w:tr>
         <w:tc>
           <w:tcPr>
-            <w:tcW w:type="dxa" w:w="2160"/>
+            <w:tcW w:type="dxa" w:w="1728"/>
           </w:tcPr>
           <w:p>
             <w:r>
-              <w:t>内容片段</w:t>
+              <w:t>规则</w:t>
             </w:r>
           </w:p>
         </w:tc>
         <w:tc>
           <w:tcPr>
-            <w:tcW w:type="dxa" w:w="2160"/>
+            <w:tcW w:type="dxa" w:w="1728"/>
           </w:tcPr>
           <w:p>
             <w:r>
-              <w:t>问题类型</w:t>
+              <w:t>来源</w:t>
             </w:r>
           </w:p>
         </w:tc>
         <w:tc>
           <w:tcPr>
-            <w:tcW w:type="dxa" w:w="2160"/>
+            <w:tcW w:type="dxa" w:w="1728"/>
           </w:tcPr>
           <w:p>
             <w:r>
-              <w:t>问题描述</w:t>
+              <w:t>严重程度</w:t>
             </w:r>
           </w:p>
         </w:tc>
         <w:tc>
           <w:tcPr>
-            <w:tcW w:type="dxa" w:w="2160"/>
+            <w:tcW w:type="dxa" w:w="1728"/>
+          </w:tcPr>
+          <w:p>
+            <w:r>
+              <w:t>描述</w:t>
+            </w:r>
+          </w:p>
+        </w:tc>
+        <w:tc>
+          <w:tcPr>
+            <w:tcW w:type="dxa" w:w="1728"/>
           </w:tcPr>
           <w:p>
             <w:r>
@@ -290,41 +313,51 @@
       <w:tr>
         <w:tc>
           <w:tcPr>
-            <w:tcW w:type="dxa" w:w="2160"/>
+            <w:tcW w:type="dxa" w:w="1728"/>
           </w:tcPr>
           <w:p>
             <w:r>
-              <w:t>在这场没有硝烟地战争中，这些在战役中逆行地勇士，放弃大年三十与家人团聚、与多年不见好友相聚的机会，义无反顾冲在第一线，坚守着自己的岗位。从每天的新闻中，可以看到在前线的白衣天使不分昼夜的与病毒搏斗，看...</w:t>
+              <w:t>LLM 审查</w:t>
             </w:r>
           </w:p>
         </w:tc>
         <w:tc>
           <w:tcPr>
-            <w:tcW w:type="dxa" w:w="2160"/>
+            <w:tcW w:type="dxa" w:w="1728"/>
           </w:tcPr>
           <w:p>
             <w:r>
-              <w:t>WARNING</w:t>
+              <w:t>LLM</w:t>
             </w:r>
           </w:p>
         </w:tc>
         <w:tc>
           <w:tcPr>
-            <w:tcW w:type="dxa" w:w="2160"/>
+            <w:tcW w:type="dxa" w:w="1728"/>
           </w:tcPr>
           <w:p>
             <w:r>
-              <w:t>连续标点符号: 2处</w:t>
+              <w:t>ERROR</w:t>
             </w:r>
           </w:p>
         </w:tc>
         <w:tc>
           <w:tcPr>
-            <w:tcW w:type="dxa" w:w="2160"/>
+            <w:tcW w:type="dxa" w:w="1728"/>
           </w:tcPr>
           <w:p>
             <w:r>
-              <w:t>避免连续使用标点</w:t>
+              <w:t>标题格式不规范。通常标题应使用中文全角标点，如“1. 标题”或“一、标题”，且标题后不应直接接正文，应有换行或空行。当前片段仅为“1.标题”，序号与标题之间缺少空格，且未明确后续内容。</w:t>
+            </w:r>
+          </w:p>
+        </w:tc>
+        <w:tc>
+          <w:tcPr>
+            <w:tcW w:type="dxa" w:w="1728"/>
+          </w:tcPr>
+          <w:p>
+            <w:r>
+              <w:t>建议在序号“1.”和“标题”之间添加一个空格，即修改为“1. 标题”。同时，根据文档整体结构，确认此标题的层级和后续内容是否完整。</w:t>
             </w:r>
           </w:p>
         </w:tc>
@@ -332,10 +365,23 @@
     </w:tbl>
     <w:p>
       <w:pPr>
-        <w:pStyle w:val="Heading1"/>
+        <w:pStyle w:val="Heading2"/>
       </w:pPr>
       <w:r>
-        <w:t>LLM审查问题</w:t>
+        <w:t>章节 section_3</w:t>
+      </w:r>
+    </w:p>
+    <w:p>
+      <w:r>
+        <w:t>随着年味愈来愈浓时，一场突如其来的疫情防控狙击战骤然打响。...</w:t>
+      </w:r>
+    </w:p>
+    <w:p>
+      <w:pPr>
+        <w:pStyle w:val="Heading3"/>
+      </w:pPr>
+      <w:r>
+        <w:t>规则问题</w:t>
       </w:r>
     </w:p>
     <w:tbl>
@@ -345,25 +391,36 @@
         <w:tblLook w:firstColumn="1" w:firstRow="1" w:lastColumn="0" w:lastRow="0" w:noHBand="0" w:noVBand="1" w:val="04A0"/>
       </w:tblPr>
       <w:tblGrid>
-        <w:gridCol w:w="2160"/>
-        <w:gridCol w:w="2160"/>
-        <w:gridCol w:w="2160"/>
-        <w:gridCol w:w="2160"/>
+        <w:gridCol w:w="1728"/>
+        <w:gridCol w:w="1728"/>
+        <w:gridCol w:w="1728"/>
+        <w:gridCol w:w="1728"/>
+        <w:gridCol w:w="1728"/>
       </w:tblGrid>
       <w:tr>
         <w:tc>
           <w:tcPr>
-            <w:tcW w:type="dxa" w:w="2160"/>
+            <w:tcW w:type="dxa" w:w="1728"/>
           </w:tcPr>
           <w:p>
             <w:r>
-              <w:t>内容片段</w:t>
+              <w:t>规则</w:t>
             </w:r>
           </w:p>
         </w:tc>
         <w:tc>
           <w:tcPr>
-            <w:tcW w:type="dxa" w:w="2160"/>
+            <w:tcW w:type="dxa" w:w="1728"/>
+          </w:tcPr>
+          <w:p>
+            <w:r>
+              <w:t>来源</w:t>
+            </w:r>
+          </w:p>
+        </w:tc>
+        <w:tc>
+          <w:tcPr>
+            <w:tcW w:type="dxa" w:w="1728"/>
           </w:tcPr>
           <w:p>
             <w:r>
@@ -373,17 +430,17 @@
         </w:tc>
         <w:tc>
           <w:tcPr>
-            <w:tcW w:type="dxa" w:w="2160"/>
+            <w:tcW w:type="dxa" w:w="1728"/>
           </w:tcPr>
           <w:p>
             <w:r>
-              <w:t>问题描述</w:t>
+              <w:t>描述</w:t>
             </w:r>
           </w:p>
         </w:tc>
         <w:tc>
           <w:tcPr>
-            <w:tcW w:type="dxa" w:w="2160"/>
+            <w:tcW w:type="dxa" w:w="1728"/>
           </w:tcPr>
           <w:p>
             <w:r>
@@ -395,41 +452,51 @@
       <w:tr>
         <w:tc>
           <w:tcPr>
-            <w:tcW w:type="dxa" w:w="2160"/>
+            <w:tcW w:type="dxa" w:w="1728"/>
           </w:tcPr>
           <w:p>
             <w:r>
-              <w:t>逆风而行的你...</w:t>
+              <w:t>LLM 审查</w:t>
             </w:r>
           </w:p>
         </w:tc>
         <w:tc>
           <w:tcPr>
-            <w:tcW w:type="dxa" w:w="2160"/>
+            <w:tcW w:type="dxa" w:w="1728"/>
           </w:tcPr>
           <w:p>
             <w:r>
-              <w:t>error</w:t>
+              <w:t>LLM</w:t>
             </w:r>
           </w:p>
         </w:tc>
         <w:tc>
           <w:tcPr>
-            <w:tcW w:type="dxa" w:w="2160"/>
+            <w:tcW w:type="dxa" w:w="1728"/>
           </w:tcPr>
           <w:p>
             <w:r>
-              <w:t>文档片段“逆风而行的你”为文学性标题，不符合工程文档的客观、严谨、技术性要求，存在严重的排版与内容适用性问题。</w:t>
+              <w:t>ERROR</w:t>
             </w:r>
           </w:p>
         </w:tc>
         <w:tc>
           <w:tcPr>
-            <w:tcW w:type="dxa" w:w="2160"/>
+            <w:tcW w:type="dxa" w:w="1728"/>
           </w:tcPr>
           <w:p>
             <w:r>
-              <w:t>将标题修改为能准确反映文档技术内容的标题，例如“XX作动系统故障模式分析报告”或“XX系统逆风工况影响评估”。</w:t>
+              <w:t>“愈来愈浓时”中的“时”字使用不当，导致句子逻辑不通顺。</w:t>
+            </w:r>
+          </w:p>
+        </w:tc>
+        <w:tc>
+          <w:tcPr>
+            <w:tcW w:type="dxa" w:w="1728"/>
+          </w:tcPr>
+          <w:p>
+            <w:r>
+              <w:t>建议将“随着年味愈来愈浓时”修改为“随着年味愈来愈浓”或“当年味愈来愈浓时”。</w:t>
             </w:r>
           </w:p>
         </w:tc>
@@ -437,121 +504,47 @@
       <w:tr>
         <w:tc>
           <w:tcPr>
-            <w:tcW w:type="dxa" w:w="2160"/>
+            <w:tcW w:type="dxa" w:w="1728"/>
           </w:tcPr>
           <w:p>
             <w:r>
-              <w:t>逆风而行的你...</w:t>
+              <w:t>LLM 审查</w:t>
             </w:r>
           </w:p>
         </w:tc>
         <w:tc>
           <w:tcPr>
-            <w:tcW w:type="dxa" w:w="2160"/>
+            <w:tcW w:type="dxa" w:w="1728"/>
           </w:tcPr>
           <w:p>
             <w:r>
-              <w:t>error</w:t>
+              <w:t>LLM</w:t>
             </w:r>
           </w:p>
         </w:tc>
         <w:tc>
           <w:tcPr>
-            <w:tcW w:type="dxa" w:w="2160"/>
+            <w:tcW w:type="dxa" w:w="1728"/>
           </w:tcPr>
           <w:p>
             <w:r>
-              <w:t>片段“逆风而行的你”使用了拟人化修辞，在工程语境下构成语法与语义错误。</w:t>
+              <w:t>ERROR</w:t>
             </w:r>
           </w:p>
         </w:tc>
         <w:tc>
           <w:tcPr>
-            <w:tcW w:type="dxa" w:w="2160"/>
+            <w:tcW w:type="dxa" w:w="1728"/>
           </w:tcPr>
           <w:p>
             <w:r>
-              <w:t>删除拟人化表达，使用客观陈述句描述系统、部件或工况，例如“系统在逆风工况下的性能分析”。</w:t>
-            </w:r>
-          </w:p>
-        </w:tc>
-      </w:tr>
-      <w:tr>
-        <w:tc>
-          <w:tcPr>
-            <w:tcW w:type="dxa" w:w="2160"/>
-          </w:tcPr>
-          <w:p>
-            <w:r>
-              <w:t>随着年味愈来愈浓时，一场突如其来的疫情防控狙击战骤然打响。...</w:t>
+              <w:t>“狙击战”为错别字，正确应为“阻击战”。</w:t>
             </w:r>
           </w:p>
         </w:tc>
         <w:tc>
           <w:tcPr>
-            <w:tcW w:type="dxa" w:w="2160"/>
-          </w:tcPr>
-          <w:p>
-            <w:r>
-              <w:t>error</w:t>
-            </w:r>
-          </w:p>
-        </w:tc>
-        <w:tc>
-          <w:tcPr>
-            <w:tcW w:type="dxa" w:w="2160"/>
-          </w:tcPr>
-          <w:p>
-            <w:r>
-              <w:t>存在口语化表达及非工程用语。“愈来愈浓时”和“狙击战”为文学性描述，不符合工程文档的客观、严谨要求。</w:t>
-            </w:r>
-          </w:p>
-        </w:tc>
-        <w:tc>
-          <w:tcPr>
-            <w:tcW w:type="dxa" w:w="2160"/>
-          </w:tcPr>
-          <w:p>
-            <w:r>
-              <w:t>将“随着年味愈来愈浓时，一场突如其来的疫情防控狙击战骤然打响。”修改为客观陈述，例如：“在特定时间节点，突发公共卫生事件应急响应机制被启动。”</w:t>
-            </w:r>
-          </w:p>
-        </w:tc>
-      </w:tr>
-      <w:tr>
-        <w:tc>
-          <w:tcPr>
-            <w:tcW w:type="dxa" w:w="2160"/>
-          </w:tcPr>
-          <w:p>
-            <w:r>
-              <w:t>随着年味愈来愈浓时，一场突如其来的疫情防控狙击战骤然打响。...</w:t>
-            </w:r>
-          </w:p>
-        </w:tc>
-        <w:tc>
-          <w:tcPr>
-            <w:tcW w:type="dxa" w:w="2160"/>
-          </w:tcPr>
-          <w:p>
-            <w:r>
-              <w:t>error</w:t>
-            </w:r>
-          </w:p>
-        </w:tc>
-        <w:tc>
-          <w:tcPr>
-            <w:tcW w:type="dxa" w:w="2160"/>
-          </w:tcPr>
-          <w:p>
-            <w:r>
-              <w:t>用词不准确。“狙击战”应为“阻击战”。</w:t>
-            </w:r>
-          </w:p>
-        </w:tc>
-        <w:tc>
-          <w:tcPr>
-            <w:tcW w:type="dxa" w:w="2160"/>
+            <w:tcW w:type="dxa" w:w="1728"/>
           </w:tcPr>
           <w:p>
             <w:r>
@@ -560,44 +553,89 @@
           </w:p>
         </w:tc>
       </w:tr>
+    </w:tbl>
+    <w:p>
+      <w:pPr>
+        <w:pStyle w:val="Heading2"/>
+      </w:pPr>
+      <w:r>
+        <w:t>章节 section_4</w:t>
+      </w:r>
+    </w:p>
+    <w:p>
+      <w:r>
+        <w:t>在这场没有硝烟地战争中，这些在战役中逆行地勇士，放弃大年三十与家人团聚、与多年不见好友相聚的机会，义无反顾冲在第一线，坚守着自己的岗位。从每天的新闻中，可以看到在前线的白衣天使不分昼夜的与病毒搏斗，看着他们憔悴的背影，被口罩勒伤的脸，有一种莫名的心疼。在这个新年中，谁不想在家人身边做个无忧无虑的孩子。可是，，现在却不得不担起重任，去保护那些病人。还有各省许多请愿支援武汉的医护人员，不管父母的反对，不顾朋友的劝说，逆风而行，在昏暗地方，照亮无数陌生的过客。还有那些在外站岗的警察，维持着一座城的秩序，不畏严寒，坚持站在在自己的岗位上。。...</w:t>
+      </w:r>
+    </w:p>
+    <w:p>
+      <w:pPr>
+        <w:pStyle w:val="Heading3"/>
+      </w:pPr>
+      <w:r>
+        <w:t>规则问题</w:t>
+      </w:r>
+    </w:p>
+    <w:tbl>
+      <w:tblPr>
+        <w:tblStyle w:val="TableGrid"/>
+        <w:tblW w:type="auto" w:w="0"/>
+        <w:tblLook w:firstColumn="1" w:firstRow="1" w:lastColumn="0" w:lastRow="0" w:noHBand="0" w:noVBand="1" w:val="04A0"/>
+      </w:tblPr>
+      <w:tblGrid>
+        <w:gridCol w:w="1728"/>
+        <w:gridCol w:w="1728"/>
+        <w:gridCol w:w="1728"/>
+        <w:gridCol w:w="1728"/>
+        <w:gridCol w:w="1728"/>
+      </w:tblGrid>
       <w:tr>
         <w:tc>
           <w:tcPr>
-            <w:tcW w:type="dxa" w:w="2160"/>
+            <w:tcW w:type="dxa" w:w="1728"/>
           </w:tcPr>
           <w:p>
             <w:r>
-              <w:t>在这场没有硝烟地战争中，这些在战役中逆行地勇士，放弃大年三十与家人团聚、与多年不见好友相聚的机会，义无反顾冲在第一线，坚守着自己的岗位。从每天的新闻中，可以看到在前线的白衣天使不分昼夜的与病毒搏斗，看...</w:t>
+              <w:t>规则</w:t>
             </w:r>
           </w:p>
         </w:tc>
         <w:tc>
           <w:tcPr>
-            <w:tcW w:type="dxa" w:w="2160"/>
+            <w:tcW w:type="dxa" w:w="1728"/>
           </w:tcPr>
           <w:p>
             <w:r>
-              <w:t>error</w:t>
+              <w:t>来源</w:t>
             </w:r>
           </w:p>
         </w:tc>
         <w:tc>
           <w:tcPr>
-            <w:tcW w:type="dxa" w:w="2160"/>
+            <w:tcW w:type="dxa" w:w="1728"/>
           </w:tcPr>
           <w:p>
             <w:r>
-              <w:t>存在多处标点符号使用错误，包括逗号、句号、顿号使用不当，以及空格缺失。</w:t>
+              <w:t>严重程度</w:t>
             </w:r>
           </w:p>
         </w:tc>
         <w:tc>
           <w:tcPr>
-            <w:tcW w:type="dxa" w:w="2160"/>
+            <w:tcW w:type="dxa" w:w="1728"/>
           </w:tcPr>
           <w:p>
             <w:r>
-              <w:t>将“地”战争、“地”勇士、“地”方中的“地”修改为“的”。将“可是，，现在”中的双逗号修改为单逗号。将“坚持站在在自己的岗位上。”中的“在在”修改为“在”。在“可是，”后、“现在”前添加空格。将“与多年不见好友相聚”修改为“与多年不见的好友相聚”。</w:t>
+              <w:t>描述</w:t>
+            </w:r>
+          </w:p>
+        </w:tc>
+        <w:tc>
+          <w:tcPr>
+            <w:tcW w:type="dxa" w:w="1728"/>
+          </w:tcPr>
+          <w:p>
+            <w:r>
+              <w:t>建议</w:t>
             </w:r>
           </w:p>
         </w:tc>
@@ -605,41 +643,51 @@
       <w:tr>
         <w:tc>
           <w:tcPr>
-            <w:tcW w:type="dxa" w:w="2160"/>
+            <w:tcW w:type="dxa" w:w="1728"/>
           </w:tcPr>
           <w:p>
             <w:r>
-              <w:t>在这场没有硝烟地战争中，这些在战役中逆行地勇士，放弃大年三十与家人团聚、与多年不见好友相聚的机会，义无反顾冲在第一线，坚守着自己的岗位。从每天的新闻中，可以看到在前线的白衣天使不分昼夜的与病毒搏斗，看...</w:t>
+              <w:t>LLM 审查</w:t>
             </w:r>
           </w:p>
         </w:tc>
         <w:tc>
           <w:tcPr>
-            <w:tcW w:type="dxa" w:w="2160"/>
+            <w:tcW w:type="dxa" w:w="1728"/>
           </w:tcPr>
           <w:p>
             <w:r>
-              <w:t>error</w:t>
+              <w:t>LLM</w:t>
             </w:r>
           </w:p>
         </w:tc>
         <w:tc>
           <w:tcPr>
-            <w:tcW w:type="dxa" w:w="2160"/>
+            <w:tcW w:type="dxa" w:w="1728"/>
           </w:tcPr>
           <w:p>
             <w:r>
-              <w:t>存在多处“的、地、得”使用错误。</w:t>
+              <w:t>ERROR</w:t>
             </w:r>
           </w:p>
         </w:tc>
         <w:tc>
           <w:tcPr>
-            <w:tcW w:type="dxa" w:w="2160"/>
+            <w:tcW w:type="dxa" w:w="1728"/>
           </w:tcPr>
           <w:p>
             <w:r>
-              <w:t>将“没有硝烟地战争”修改为“没有硝烟的战争”。将“逆行地勇士”修改为“逆行的勇士”。将“在昏暗地方”修改为“在昏暗的地方”。</w:t>
+              <w:t>“地”使用错误，应为“的”。原文中“没有硝烟地战争”应为“没有硝烟的战争”。</w:t>
+            </w:r>
+          </w:p>
+        </w:tc>
+        <w:tc>
+          <w:tcPr>
+            <w:tcW w:type="dxa" w:w="1728"/>
+          </w:tcPr>
+          <w:p>
+            <w:r>
+              <w:t>将“没有硝烟地战争”修改为“没有硝烟的战争”。</w:t>
             </w:r>
           </w:p>
         </w:tc>
@@ -647,41 +695,51 @@
       <w:tr>
         <w:tc>
           <w:tcPr>
-            <w:tcW w:type="dxa" w:w="2160"/>
+            <w:tcW w:type="dxa" w:w="1728"/>
           </w:tcPr>
           <w:p>
             <w:r>
-              <w:t>2.小标题...</w:t>
+              <w:t>LLM 审查</w:t>
             </w:r>
           </w:p>
         </w:tc>
         <w:tc>
           <w:tcPr>
-            <w:tcW w:type="dxa" w:w="2160"/>
+            <w:tcW w:type="dxa" w:w="1728"/>
           </w:tcPr>
           <w:p>
             <w:r>
-              <w:t>error</w:t>
+              <w:t>LLM</w:t>
             </w:r>
           </w:p>
         </w:tc>
         <w:tc>
           <w:tcPr>
-            <w:tcW w:type="dxa" w:w="2160"/>
+            <w:tcW w:type="dxa" w:w="1728"/>
           </w:tcPr>
           <w:p>
             <w:r>
-              <w:t>标题层级标识不规范，缺少明确的标题编号或层级符号。</w:t>
+              <w:t>ERROR</w:t>
             </w:r>
           </w:p>
         </w:tc>
         <w:tc>
           <w:tcPr>
-            <w:tcW w:type="dxa" w:w="2160"/>
+            <w:tcW w:type="dxa" w:w="1728"/>
           </w:tcPr>
           <w:p>
             <w:r>
-              <w:t>根据文档层级结构，为标题添加规范的编号，例如“2.1”、“2.2”或使用明确的层级符号如“## 小标题”。</w:t>
+              <w:t>“地”使用错误，应为“的”。原文中“逆行地勇士”应为“逆行的勇士”。</w:t>
+            </w:r>
+          </w:p>
+        </w:tc>
+        <w:tc>
+          <w:tcPr>
+            <w:tcW w:type="dxa" w:w="1728"/>
+          </w:tcPr>
+          <w:p>
+            <w:r>
+              <w:t>将“逆行地勇士”修改为“逆行的勇士”。</w:t>
             </w:r>
           </w:p>
         </w:tc>
@@ -689,41 +747,51 @@
       <w:tr>
         <w:tc>
           <w:tcPr>
-            <w:tcW w:type="dxa" w:w="2160"/>
+            <w:tcW w:type="dxa" w:w="1728"/>
           </w:tcPr>
           <w:p>
             <w:r>
-              <w:t>2.小标题...</w:t>
+              <w:t>LLM 审查</w:t>
             </w:r>
           </w:p>
         </w:tc>
         <w:tc>
           <w:tcPr>
-            <w:tcW w:type="dxa" w:w="2160"/>
+            <w:tcW w:type="dxa" w:w="1728"/>
           </w:tcPr>
           <w:p>
             <w:r>
-              <w:t>warning</w:t>
+              <w:t>LLM</w:t>
             </w:r>
           </w:p>
         </w:tc>
         <w:tc>
           <w:tcPr>
-            <w:tcW w:type="dxa" w:w="2160"/>
+            <w:tcW w:type="dxa" w:w="1728"/>
           </w:tcPr>
           <w:p>
             <w:r>
-              <w:t>标题内容过于简略，未能清晰概括其下辖内容。</w:t>
+              <w:t>ERROR</w:t>
             </w:r>
           </w:p>
         </w:tc>
         <w:tc>
           <w:tcPr>
-            <w:tcW w:type="dxa" w:w="2160"/>
+            <w:tcW w:type="dxa" w:w="1728"/>
           </w:tcPr>
           <w:p>
             <w:r>
-              <w:t>将“小标题”修改为具体、能概括本节核心内容的标题，例如“2. 系统架构概述”或“2. 设计依据与标准”。</w:t>
+              <w:t>“地”使用错误，应为“的”。原文中“昏暗地方”应为“昏暗的地方”。</w:t>
+            </w:r>
+          </w:p>
+        </w:tc>
+        <w:tc>
+          <w:tcPr>
+            <w:tcW w:type="dxa" w:w="1728"/>
+          </w:tcPr>
+          <w:p>
+            <w:r>
+              <w:t>将“昏暗地方”修改为“昏暗的地方”。</w:t>
             </w:r>
           </w:p>
         </w:tc>
@@ -731,41 +799,51 @@
       <w:tr>
         <w:tc>
           <w:tcPr>
-            <w:tcW w:type="dxa" w:w="2160"/>
+            <w:tcW w:type="dxa" w:w="1728"/>
           </w:tcPr>
           <w:p>
             <w:r>
-              <w:t>看到各地医疗物资纷纷告急，国内外的同胞们想尽一切办法，为在一线地医护人员提供尽可能多的物资。正是有了这些资源装备,一线的战士才能齐装上阵，而不是赤手空拳。他们得帮助也至关重要。他们是幕后的英雄。...</w:t>
+              <w:t>LLM 审查</w:t>
             </w:r>
           </w:p>
         </w:tc>
         <w:tc>
           <w:tcPr>
-            <w:tcW w:type="dxa" w:w="2160"/>
+            <w:tcW w:type="dxa" w:w="1728"/>
           </w:tcPr>
           <w:p>
             <w:r>
-              <w:t>error</w:t>
+              <w:t>LLM</w:t>
             </w:r>
           </w:p>
         </w:tc>
         <w:tc>
           <w:tcPr>
-            <w:tcW w:type="dxa" w:w="2160"/>
+            <w:tcW w:type="dxa" w:w="1728"/>
           </w:tcPr>
           <w:p>
             <w:r>
-              <w:t>标点使用不规范，存在中文全角标点与英文半角标点混用的情况。</w:t>
+              <w:t>ERROR</w:t>
             </w:r>
           </w:p>
         </w:tc>
         <w:tc>
           <w:tcPr>
-            <w:tcW w:type="dxa" w:w="2160"/>
+            <w:tcW w:type="dxa" w:w="1728"/>
           </w:tcPr>
           <w:p>
             <w:r>
-              <w:t>将英文半角逗号“,”和句号“.”统一修改为中文全角标点“，”和“。”。</w:t>
+              <w:t>标点符号使用错误。原文中“可是，，现在”存在连续两个逗号。</w:t>
+            </w:r>
+          </w:p>
+        </w:tc>
+        <w:tc>
+          <w:tcPr>
+            <w:tcW w:type="dxa" w:w="1728"/>
+          </w:tcPr>
+          <w:p>
+            <w:r>
+              <w:t>将“可是，，现在”修改为“可是，现在”。</w:t>
             </w:r>
           </w:p>
         </w:tc>
@@ -773,41 +851,51 @@
       <w:tr>
         <w:tc>
           <w:tcPr>
-            <w:tcW w:type="dxa" w:w="2160"/>
+            <w:tcW w:type="dxa" w:w="1728"/>
           </w:tcPr>
           <w:p>
             <w:r>
-              <w:t>看到各地医疗物资纷纷告急，国内外的同胞们想尽一切办法，为在一线地医护人员提供尽可能多的物资。正是有了这些资源装备,一线的战士才能齐装上阵，而不是赤手空拳。他们得帮助也至关重要。他们是幕后的英雄。...</w:t>
+              <w:t>LLM 审查</w:t>
             </w:r>
           </w:p>
         </w:tc>
         <w:tc>
           <w:tcPr>
-            <w:tcW w:type="dxa" w:w="2160"/>
+            <w:tcW w:type="dxa" w:w="1728"/>
           </w:tcPr>
           <w:p>
             <w:r>
-              <w:t>error</w:t>
+              <w:t>LLM</w:t>
             </w:r>
           </w:p>
         </w:tc>
         <w:tc>
           <w:tcPr>
-            <w:tcW w:type="dxa" w:w="2160"/>
+            <w:tcW w:type="dxa" w:w="1728"/>
           </w:tcPr>
           <w:p>
             <w:r>
-              <w:t>存在“的、地、得”使用错误。</w:t>
+              <w:t>ERROR</w:t>
             </w:r>
           </w:p>
         </w:tc>
         <w:tc>
           <w:tcPr>
-            <w:tcW w:type="dxa" w:w="2160"/>
+            <w:tcW w:type="dxa" w:w="1728"/>
           </w:tcPr>
           <w:p>
             <w:r>
-              <w:t>将“在一线地医护人员”修改为“在一线的医护人员”；将“他们得帮助”修改为“他们的帮助”。</w:t>
+              <w:t>标点符号使用错误。原文中“站在在自己的岗位上”存在重复的“在”。</w:t>
+            </w:r>
+          </w:p>
+        </w:tc>
+        <w:tc>
+          <w:tcPr>
+            <w:tcW w:type="dxa" w:w="1728"/>
+          </w:tcPr>
+          <w:p>
+            <w:r>
+              <w:t>将“站在在自己的岗位上”修改为“坚守在自己的岗位上”或“站在自己的岗位上”。</w:t>
             </w:r>
           </w:p>
         </w:tc>
@@ -815,41 +903,138 @@
       <w:tr>
         <w:tc>
           <w:tcPr>
-            <w:tcW w:type="dxa" w:w="2160"/>
+            <w:tcW w:type="dxa" w:w="1728"/>
           </w:tcPr>
           <w:p>
             <w:r>
-              <w:t>看到各地医疗物资纷纷告急，国内外的同胞们想尽一切办法，为在一线地医护人员提供尽可能多的物资。正是有了这些资源装备,一线的战士才能齐装上阵，而不是赤手空拳。他们得帮助也至关重要。他们是幕后的英雄。...</w:t>
+              <w:t>LLM 审查</w:t>
             </w:r>
           </w:p>
         </w:tc>
         <w:tc>
           <w:tcPr>
-            <w:tcW w:type="dxa" w:w="2160"/>
+            <w:tcW w:type="dxa" w:w="1728"/>
           </w:tcPr>
           <w:p>
             <w:r>
-              <w:t>error</w:t>
+              <w:t>LLM</w:t>
             </w:r>
           </w:p>
         </w:tc>
         <w:tc>
           <w:tcPr>
-            <w:tcW w:type="dxa" w:w="2160"/>
+            <w:tcW w:type="dxa" w:w="1728"/>
           </w:tcPr>
           <w:p>
             <w:r>
-              <w:t>存在错别字。</w:t>
+              <w:t>WARNING</w:t>
             </w:r>
           </w:p>
         </w:tc>
         <w:tc>
           <w:tcPr>
-            <w:tcW w:type="dxa" w:w="2160"/>
+            <w:tcW w:type="dxa" w:w="1728"/>
           </w:tcPr>
           <w:p>
             <w:r>
-              <w:t>将“齐装上阵”修改为“披挂上阵”或“整装上阵”。</w:t>
+              <w:t>句子结尾使用了句号“。”，但段落整体为叙述性文字，建议保持统一。此处问题较小，但“。”后紧跟两个句号，属于排版错误。</w:t>
+            </w:r>
+          </w:p>
+        </w:tc>
+        <w:tc>
+          <w:tcPr>
+            <w:tcW w:type="dxa" w:w="1728"/>
+          </w:tcPr>
+          <w:p>
+            <w:r>
+              <w:t>检查并统一段落结尾的标点。将段落最后的“。”调整为正常的句号，并确保其后没有多余空格或标点。</w:t>
+            </w:r>
+          </w:p>
+        </w:tc>
+      </w:tr>
+    </w:tbl>
+    <w:p>
+      <w:pPr>
+        <w:pStyle w:val="Heading2"/>
+      </w:pPr>
+      <w:r>
+        <w:t>章节 section_5</w:t>
+      </w:r>
+    </w:p>
+    <w:p>
+      <w:r>
+        <w:t>2.小标题...</w:t>
+      </w:r>
+    </w:p>
+    <w:p>
+      <w:pPr>
+        <w:pStyle w:val="Heading3"/>
+      </w:pPr>
+      <w:r>
+        <w:t>规则问题</w:t>
+      </w:r>
+    </w:p>
+    <w:tbl>
+      <w:tblPr>
+        <w:tblStyle w:val="TableGrid"/>
+        <w:tblW w:type="auto" w:w="0"/>
+        <w:tblLook w:firstColumn="1" w:firstRow="1" w:lastColumn="0" w:lastRow="0" w:noHBand="0" w:noVBand="1" w:val="04A0"/>
+      </w:tblPr>
+      <w:tblGrid>
+        <w:gridCol w:w="1728"/>
+        <w:gridCol w:w="1728"/>
+        <w:gridCol w:w="1728"/>
+        <w:gridCol w:w="1728"/>
+        <w:gridCol w:w="1728"/>
+      </w:tblGrid>
+      <w:tr>
+        <w:tc>
+          <w:tcPr>
+            <w:tcW w:type="dxa" w:w="1728"/>
+          </w:tcPr>
+          <w:p>
+            <w:r>
+              <w:t>规则</w:t>
+            </w:r>
+          </w:p>
+        </w:tc>
+        <w:tc>
+          <w:tcPr>
+            <w:tcW w:type="dxa" w:w="1728"/>
+          </w:tcPr>
+          <w:p>
+            <w:r>
+              <w:t>来源</w:t>
+            </w:r>
+          </w:p>
+        </w:tc>
+        <w:tc>
+          <w:tcPr>
+            <w:tcW w:type="dxa" w:w="1728"/>
+          </w:tcPr>
+          <w:p>
+            <w:r>
+              <w:t>严重程度</w:t>
+            </w:r>
+          </w:p>
+        </w:tc>
+        <w:tc>
+          <w:tcPr>
+            <w:tcW w:type="dxa" w:w="1728"/>
+          </w:tcPr>
+          <w:p>
+            <w:r>
+              <w:t>描述</w:t>
+            </w:r>
+          </w:p>
+        </w:tc>
+        <w:tc>
+          <w:tcPr>
+            <w:tcW w:type="dxa" w:w="1728"/>
+          </w:tcPr>
+          <w:p>
+            <w:r>
+              <w:t>建议</w:t>
             </w:r>
           </w:p>
         </w:tc>
@@ -857,41 +1042,138 @@
       <w:tr>
         <w:tc>
           <w:tcPr>
-            <w:tcW w:type="dxa" w:w="2160"/>
+            <w:tcW w:type="dxa" w:w="1728"/>
           </w:tcPr>
           <w:p>
             <w:r>
-              <w:t>测试错误...</w:t>
+              <w:t>LLM 审查</w:t>
             </w:r>
           </w:p>
         </w:tc>
         <w:tc>
           <w:tcPr>
-            <w:tcW w:type="dxa" w:w="2160"/>
+            <w:tcW w:type="dxa" w:w="1728"/>
           </w:tcPr>
           <w:p>
             <w:r>
-              <w:t>error</w:t>
+              <w:t>LLM</w:t>
             </w:r>
           </w:p>
         </w:tc>
         <w:tc>
           <w:tcPr>
-            <w:tcW w:type="dxa" w:w="2160"/>
+            <w:tcW w:type="dxa" w:w="1728"/>
           </w:tcPr>
           <w:p>
             <w:r>
-              <w:t>标题“测试错误”过于口语化，不符合工程文档的正式性要求。</w:t>
+              <w:t>ERROR</w:t>
             </w:r>
           </w:p>
         </w:tc>
         <w:tc>
           <w:tcPr>
-            <w:tcW w:type="dxa" w:w="2160"/>
+            <w:tcW w:type="dxa" w:w="1728"/>
           </w:tcPr>
           <w:p>
             <w:r>
-              <w:t>根据章节具体内容，修改为更具描述性的标题，例如“测试异常处理”、“测试故障注入”或“测试失效模式分析”。</w:t>
+              <w:t>小标题前使用了阿拉伯数字“2.”，但缺少对应的上级标题“1.”，导致序号不连贯。同时，标题后缺少必要的正文内容。</w:t>
+            </w:r>
+          </w:p>
+        </w:tc>
+        <w:tc>
+          <w:tcPr>
+            <w:tcW w:type="dxa" w:w="1728"/>
+          </w:tcPr>
+          <w:p>
+            <w:r>
+              <w:t>请检查标题的层级和编号是否完整。如果这是二级标题，应确保其上级一级标题存在（例如“1.大标题”）。如果这是文档中唯一的标题，建议将其修改为一级标题“一、小标题”或直接使用“小标题”而不加数字编号。标题后应补充相应的正文内容。</w:t>
+            </w:r>
+          </w:p>
+        </w:tc>
+      </w:tr>
+    </w:tbl>
+    <w:p>
+      <w:pPr>
+        <w:pStyle w:val="Heading2"/>
+      </w:pPr>
+      <w:r>
+        <w:t>章节 section_6</w:t>
+      </w:r>
+    </w:p>
+    <w:p>
+      <w:r>
+        <w:t>看到各地医疗物资纷纷告急，国内外的同胞们想尽一切办法，为在一线地医护人员提供尽可能多的物资。正是有了这些资源装备,一线的战士才能齐装上阵，而不是赤手空拳。他们得帮助也至关重要。他们是幕后的英雄。...</w:t>
+      </w:r>
+    </w:p>
+    <w:p>
+      <w:pPr>
+        <w:pStyle w:val="Heading3"/>
+      </w:pPr>
+      <w:r>
+        <w:t>规则问题</w:t>
+      </w:r>
+    </w:p>
+    <w:tbl>
+      <w:tblPr>
+        <w:tblStyle w:val="TableGrid"/>
+        <w:tblW w:type="auto" w:w="0"/>
+        <w:tblLook w:firstColumn="1" w:firstRow="1" w:lastColumn="0" w:lastRow="0" w:noHBand="0" w:noVBand="1" w:val="04A0"/>
+      </w:tblPr>
+      <w:tblGrid>
+        <w:gridCol w:w="1728"/>
+        <w:gridCol w:w="1728"/>
+        <w:gridCol w:w="1728"/>
+        <w:gridCol w:w="1728"/>
+        <w:gridCol w:w="1728"/>
+      </w:tblGrid>
+      <w:tr>
+        <w:tc>
+          <w:tcPr>
+            <w:tcW w:type="dxa" w:w="1728"/>
+          </w:tcPr>
+          <w:p>
+            <w:r>
+              <w:t>规则</w:t>
+            </w:r>
+          </w:p>
+        </w:tc>
+        <w:tc>
+          <w:tcPr>
+            <w:tcW w:type="dxa" w:w="1728"/>
+          </w:tcPr>
+          <w:p>
+            <w:r>
+              <w:t>来源</w:t>
+            </w:r>
+          </w:p>
+        </w:tc>
+        <w:tc>
+          <w:tcPr>
+            <w:tcW w:type="dxa" w:w="1728"/>
+          </w:tcPr>
+          <w:p>
+            <w:r>
+              <w:t>严重程度</w:t>
+            </w:r>
+          </w:p>
+        </w:tc>
+        <w:tc>
+          <w:tcPr>
+            <w:tcW w:type="dxa" w:w="1728"/>
+          </w:tcPr>
+          <w:p>
+            <w:r>
+              <w:t>描述</w:t>
+            </w:r>
+          </w:p>
+        </w:tc>
+        <w:tc>
+          <w:tcPr>
+            <w:tcW w:type="dxa" w:w="1728"/>
+          </w:tcPr>
+          <w:p>
+            <w:r>
+              <w:t>建议</w:t>
             </w:r>
           </w:p>
         </w:tc>
@@ -899,46 +1181,364 @@
       <w:tr>
         <w:tc>
           <w:tcPr>
-            <w:tcW w:type="dxa" w:w="2160"/>
+            <w:tcW w:type="dxa" w:w="1728"/>
           </w:tcPr>
           <w:p>
             <w:r>
-              <w:t>测试错误...</w:t>
+              <w:t>LLM 审查</w:t>
             </w:r>
           </w:p>
         </w:tc>
         <w:tc>
           <w:tcPr>
-            <w:tcW w:type="dxa" w:w="2160"/>
+            <w:tcW w:type="dxa" w:w="1728"/>
           </w:tcPr>
           <w:p>
             <w:r>
-              <w:t>warning</w:t>
+              <w:t>LLM</w:t>
             </w:r>
           </w:p>
         </w:tc>
         <w:tc>
           <w:tcPr>
-            <w:tcW w:type="dxa" w:w="2160"/>
+            <w:tcW w:type="dxa" w:w="1728"/>
           </w:tcPr>
           <w:p>
             <w:r>
-              <w:t>标题“测试错误”存在歧义，可能指“测试中发现的错误”或“测试本身是错误的”。</w:t>
+              <w:t>ERROR</w:t>
             </w:r>
           </w:p>
         </w:tc>
         <w:tc>
           <w:tcPr>
-            <w:tcW w:type="dxa" w:w="2160"/>
+            <w:tcW w:type="dxa" w:w="1728"/>
           </w:tcPr>
           <w:p>
             <w:r>
-              <w:t>为避免歧义，应明确表述。若指测试中发现的缺陷，建议修改为“测试发现的缺陷”；若指测试过程或方法有误，建议修改为“测试程序错误”或“测试方法不当”。</w:t>
+              <w:t>标点符号使用不规范，中文句子中使用了英文逗号</w:t>
+            </w:r>
+          </w:p>
+        </w:tc>
+        <w:tc>
+          <w:tcPr>
+            <w:tcW w:type="dxa" w:w="1728"/>
+          </w:tcPr>
+          <w:p>
+            <w:r>
+              <w:t>将英文逗号改为中文逗号</w:t>
+            </w:r>
+          </w:p>
+        </w:tc>
+      </w:tr>
+      <w:tr>
+        <w:tc>
+          <w:tcPr>
+            <w:tcW w:type="dxa" w:w="1728"/>
+          </w:tcPr>
+          <w:p>
+            <w:r>
+              <w:t>LLM 审查</w:t>
+            </w:r>
+          </w:p>
+        </w:tc>
+        <w:tc>
+          <w:tcPr>
+            <w:tcW w:type="dxa" w:w="1728"/>
+          </w:tcPr>
+          <w:p>
+            <w:r>
+              <w:t>LLM</w:t>
+            </w:r>
+          </w:p>
+        </w:tc>
+        <w:tc>
+          <w:tcPr>
+            <w:tcW w:type="dxa" w:w="1728"/>
+          </w:tcPr>
+          <w:p>
+            <w:r>
+              <w:t>ERROR</w:t>
+            </w:r>
+          </w:p>
+        </w:tc>
+        <w:tc>
+          <w:tcPr>
+            <w:tcW w:type="dxa" w:w="1728"/>
+          </w:tcPr>
+          <w:p>
+            <w:r>
+              <w:t>“的地得”使用错误：“在一线地医护人员”应为“在一线的医护人员”</w:t>
+            </w:r>
+          </w:p>
+        </w:tc>
+        <w:tc>
+          <w:tcPr>
+            <w:tcW w:type="dxa" w:w="1728"/>
+          </w:tcPr>
+          <w:p>
+            <w:r>
+              <w:t>将“地”改为“的”</w:t>
+            </w:r>
+          </w:p>
+        </w:tc>
+      </w:tr>
+      <w:tr>
+        <w:tc>
+          <w:tcPr>
+            <w:tcW w:type="dxa" w:w="1728"/>
+          </w:tcPr>
+          <w:p>
+            <w:r>
+              <w:t>LLM 审查</w:t>
+            </w:r>
+          </w:p>
+        </w:tc>
+        <w:tc>
+          <w:tcPr>
+            <w:tcW w:type="dxa" w:w="1728"/>
+          </w:tcPr>
+          <w:p>
+            <w:r>
+              <w:t>LLM</w:t>
+            </w:r>
+          </w:p>
+        </w:tc>
+        <w:tc>
+          <w:tcPr>
+            <w:tcW w:type="dxa" w:w="1728"/>
+          </w:tcPr>
+          <w:p>
+            <w:r>
+              <w:t>ERROR</w:t>
+            </w:r>
+          </w:p>
+        </w:tc>
+        <w:tc>
+          <w:tcPr>
+            <w:tcW w:type="dxa" w:w="1728"/>
+          </w:tcPr>
+          <w:p>
+            <w:r>
+              <w:t>“的地得”使用错误：“他们得帮助”应为“他们的帮助”</w:t>
+            </w:r>
+          </w:p>
+        </w:tc>
+        <w:tc>
+          <w:tcPr>
+            <w:tcW w:type="dxa" w:w="1728"/>
+          </w:tcPr>
+          <w:p>
+            <w:r>
+              <w:t>将“得”改为“的”</w:t>
+            </w:r>
+          </w:p>
+        </w:tc>
+      </w:tr>
+      <w:tr>
+        <w:tc>
+          <w:tcPr>
+            <w:tcW w:type="dxa" w:w="1728"/>
+          </w:tcPr>
+          <w:p>
+            <w:r>
+              <w:t>LLM 审查</w:t>
+            </w:r>
+          </w:p>
+        </w:tc>
+        <w:tc>
+          <w:tcPr>
+            <w:tcW w:type="dxa" w:w="1728"/>
+          </w:tcPr>
+          <w:p>
+            <w:r>
+              <w:t>LLM</w:t>
+            </w:r>
+          </w:p>
+        </w:tc>
+        <w:tc>
+          <w:tcPr>
+            <w:tcW w:type="dxa" w:w="1728"/>
+          </w:tcPr>
+          <w:p>
+            <w:r>
+              <w:t>WARNING</w:t>
+            </w:r>
+          </w:p>
+        </w:tc>
+        <w:tc>
+          <w:tcPr>
+            <w:tcW w:type="dxa" w:w="1728"/>
+          </w:tcPr>
+          <w:p>
+            <w:r>
+              <w:t>句子之间存在空格不一致问题</w:t>
+            </w:r>
+          </w:p>
+        </w:tc>
+        <w:tc>
+          <w:tcPr>
+            <w:tcW w:type="dxa" w:w="1728"/>
+          </w:tcPr>
+          <w:p>
+            <w:r>
+              <w:t>统一句子间距，确保中文排版规范</w:t>
             </w:r>
           </w:p>
         </w:tc>
       </w:tr>
     </w:tbl>
+    <w:p>
+      <w:pPr>
+        <w:pStyle w:val="Heading2"/>
+      </w:pPr>
+      <w:r>
+        <w:t>章节 section_7</w:t>
+      </w:r>
+    </w:p>
+    <w:p>
+      <w:r>
+        <w:t>测试错误...</w:t>
+      </w:r>
+    </w:p>
+    <w:p>
+      <w:pPr>
+        <w:pStyle w:val="Heading3"/>
+      </w:pPr>
+      <w:r>
+        <w:t>规则问题</w:t>
+      </w:r>
+    </w:p>
+    <w:tbl>
+      <w:tblPr>
+        <w:tblStyle w:val="TableGrid"/>
+        <w:tblW w:type="auto" w:w="0"/>
+        <w:tblLook w:firstColumn="1" w:firstRow="1" w:lastColumn="0" w:lastRow="0" w:noHBand="0" w:noVBand="1" w:val="04A0"/>
+      </w:tblPr>
+      <w:tblGrid>
+        <w:gridCol w:w="1728"/>
+        <w:gridCol w:w="1728"/>
+        <w:gridCol w:w="1728"/>
+        <w:gridCol w:w="1728"/>
+        <w:gridCol w:w="1728"/>
+      </w:tblGrid>
+      <w:tr>
+        <w:tc>
+          <w:tcPr>
+            <w:tcW w:type="dxa" w:w="1728"/>
+          </w:tcPr>
+          <w:p>
+            <w:r>
+              <w:t>规则</w:t>
+            </w:r>
+          </w:p>
+        </w:tc>
+        <w:tc>
+          <w:tcPr>
+            <w:tcW w:type="dxa" w:w="1728"/>
+          </w:tcPr>
+          <w:p>
+            <w:r>
+              <w:t>来源</w:t>
+            </w:r>
+          </w:p>
+        </w:tc>
+        <w:tc>
+          <w:tcPr>
+            <w:tcW w:type="dxa" w:w="1728"/>
+          </w:tcPr>
+          <w:p>
+            <w:r>
+              <w:t>严重程度</w:t>
+            </w:r>
+          </w:p>
+        </w:tc>
+        <w:tc>
+          <w:tcPr>
+            <w:tcW w:type="dxa" w:w="1728"/>
+          </w:tcPr>
+          <w:p>
+            <w:r>
+              <w:t>描述</w:t>
+            </w:r>
+          </w:p>
+        </w:tc>
+        <w:tc>
+          <w:tcPr>
+            <w:tcW w:type="dxa" w:w="1728"/>
+          </w:tcPr>
+          <w:p>
+            <w:r>
+              <w:t>建议</w:t>
+            </w:r>
+          </w:p>
+        </w:tc>
+      </w:tr>
+      <w:tr>
+        <w:tc>
+          <w:tcPr>
+            <w:tcW w:type="dxa" w:w="1728"/>
+          </w:tcPr>
+          <w:p>
+            <w:r>
+              <w:t>LLM 审查</w:t>
+            </w:r>
+          </w:p>
+        </w:tc>
+        <w:tc>
+          <w:tcPr>
+            <w:tcW w:type="dxa" w:w="1728"/>
+          </w:tcPr>
+          <w:p>
+            <w:r>
+              <w:t>LLM</w:t>
+            </w:r>
+          </w:p>
+        </w:tc>
+        <w:tc>
+          <w:tcPr>
+            <w:tcW w:type="dxa" w:w="1728"/>
+          </w:tcPr>
+          <w:p>
+            <w:r>
+              <w:t>ERROR</w:t>
+            </w:r>
+          </w:p>
+        </w:tc>
+        <w:tc>
+          <w:tcPr>
+            <w:tcW w:type="dxa" w:w="1728"/>
+          </w:tcPr>
+          <w:p>
+            <w:r>
+              <w:t>文档片段“测试错误”是一个不完整的句子，缺乏明确的语境和目的，可能是一个占位符或未完成的输入。</w:t>
+            </w:r>
+          </w:p>
+        </w:tc>
+        <w:tc>
+          <w:tcPr>
+            <w:tcW w:type="dxa" w:w="1728"/>
+          </w:tcPr>
+          <w:p>
+            <w:r>
+              <w:t>请根据文档的实际内容，将其补充为一个完整、有意义的句子或段落。例如，如果这是一个标题，可以改为“【测试报告】错误记录”；如果这是一个提示，可以改为“请检查以下测试错误：”。</w:t>
+            </w:r>
+          </w:p>
+        </w:tc>
+      </w:tr>
+    </w:tbl>
+    <w:p>
+      <w:pPr>
+        <w:pStyle w:val="Heading2"/>
+      </w:pPr>
+      <w:r>
+        <w:t>章节 section_8</w:t>
+      </w:r>
+    </w:p>
+    <w:p>
+      <w:r>
+        <w:t>测试测试测试。...</w:t>
+      </w:r>
+    </w:p>
     <w:p>
       <w:pPr>
         <w:pStyle w:val="Heading1"/>
@@ -949,7 +1549,7 @@
     </w:p>
     <w:p>
       <w:r>
-        <w:t>文档内容与航空作动系统工程领域无关，属于抒情散文，存在大量格式、语法及逻辑问题，不符合工程文档审查标准。</w:t>
+        <w:t>文档情感真挚，内容积极，但存在较多格式、语法和逻辑问题，需要进行系统性修改。</w:t>
       </w:r>
     </w:p>
     <w:sectPr>
@@ -972,7 +1572,7 @@
   </w:p>
   <w:p>
     <w:r>
-      <w:t>报告生成时间: 2026-03-24 09:29:33</w:t>
+      <w:t>报告生成时间: 2026-03-26 11:30:35</w:t>
     </w:r>
   </w:p>
 </w:ftr>

</xml_diff>